<commit_message>
DOCS: Mise a jours charte graphique
Changement code couleurs dans la charte graphique
</commit_message>
<xml_diff>
--- a/DossierConception/HARMOGESTION.docx
+++ b/DossierConception/HARMOGESTION.docx
@@ -1633,7 +1633,7 @@
         <w:tc>
           <w:tcPr>
             <w:tcW w:w="988" w:type="dxa"/>
-            <w:shd w:val="clear" w:color="auto" w:fill="FCEDFF"/>
+            <w:shd w:val="clear" w:color="auto" w:fill="FDF4FF"/>
           </w:tcPr>
           <w:p>
             <w:pPr>
@@ -1689,7 +1689,15 @@
                 <w:sz w:val="24"/>
                 <w:szCs w:val="24"/>
               </w:rPr>
-              <w:t>#fcedff</w:t>
+              <w:t>#f</w:t>
+            </w:r>
+            <w:r>
+              <w:rPr>
+                <w:color w:val="1B365C"/>
+                <w:sz w:val="24"/>
+                <w:szCs w:val="24"/>
+              </w:rPr>
+              <w:t>df4ff</w:t>
             </w:r>
           </w:p>
           <w:p>
@@ -1709,12 +1717,20 @@
         <w:tc>
           <w:tcPr>
             <w:tcW w:w="994" w:type="dxa"/>
-            <w:shd w:val="clear" w:color="auto" w:fill="EA79FF"/>
+            <w:shd w:val="clear" w:color="auto" w:fill="9D22FF"/>
           </w:tcPr>
           <w:p>
             <w:pPr>
               <w:rPr>
                 <w:color w:val="1B365C"/>
+                <w:sz w:val="28"/>
+                <w:szCs w:val="28"/>
+              </w:rPr>
+            </w:pPr>
+          </w:p>
+          <w:p>
+            <w:pPr>
+              <w:rPr>
                 <w:sz w:val="28"/>
                 <w:szCs w:val="28"/>
               </w:rPr>
@@ -1740,20 +1756,34 @@
                 <w:sz w:val="28"/>
                 <w:szCs w:val="28"/>
               </w:rPr>
-              <w:t>Rose Mélodique</w:t>
-            </w:r>
-          </w:p>
-          <w:p>
-            <w:pPr>
-              <w:rPr>
-                <w:color w:val="1B365C"/>
-              </w:rPr>
-            </w:pPr>
-            <w:r>
-              <w:rPr>
-                <w:color w:val="1B365C"/>
-              </w:rPr>
-              <w:t>#ea79ff</w:t>
+              <w:t>Violet</w:t>
+            </w:r>
+            <w:r>
+              <w:rPr>
+                <w:color w:val="1B365C"/>
+                <w:sz w:val="28"/>
+                <w:szCs w:val="28"/>
+              </w:rPr>
+              <w:t xml:space="preserve"> Mélodique</w:t>
+            </w:r>
+          </w:p>
+          <w:p>
+            <w:pPr>
+              <w:rPr>
+                <w:color w:val="1B365C"/>
+              </w:rPr>
+            </w:pPr>
+            <w:r>
+              <w:rPr>
+                <w:color w:val="1B365C"/>
+              </w:rPr>
+              <w:t>#</w:t>
+            </w:r>
+            <w:r>
+              <w:rPr>
+                <w:color w:val="1B365C"/>
+              </w:rPr>
+              <w:t>9d22ff</w:t>
             </w:r>
           </w:p>
           <w:p>
@@ -2204,7 +2234,7 @@
         <w:tc>
           <w:tcPr>
             <w:tcW w:w="1413" w:type="dxa"/>
-            <w:shd w:val="clear" w:color="auto" w:fill="EA79FF"/>
+            <w:shd w:val="clear" w:color="auto" w:fill="9D22FF"/>
           </w:tcPr>
           <w:p>
             <w:pPr>
@@ -2236,14 +2266,14 @@
           <w:p>
             <w:pPr>
               <w:rPr>
-                <w:color w:val="EA79FF"/>
+                <w:color w:val="9D22FF"/>
                 <w:sz w:val="40"/>
                 <w:szCs w:val="40"/>
               </w:rPr>
             </w:pPr>
             <w:r>
               <w:rPr>
-                <w:color w:val="EA79FF"/>
+                <w:color w:val="9D22FF"/>
                 <w:sz w:val="40"/>
                 <w:szCs w:val="40"/>
               </w:rPr>
@@ -2253,14 +2283,14 @@
           <w:p>
             <w:pPr>
               <w:rPr>
-                <w:color w:val="EA79FF"/>
+                <w:color w:val="9D22FF"/>
                 <w:sz w:val="20"/>
                 <w:szCs w:val="20"/>
               </w:rPr>
             </w:pPr>
             <w:r>
               <w:rPr>
-                <w:color w:val="EA79FF"/>
+                <w:color w:val="9D22FF"/>
                 <w:sz w:val="20"/>
                 <w:szCs w:val="20"/>
               </w:rPr>

</xml_diff>